<commit_message>
Tables added to flowchart
</commit_message>
<xml_diff>
--- a/Project.docx
+++ b/Project.docx
@@ -844,7 +844,29 @@
                 <w:szCs w:val="24"/>
                 <w:lang w:bidi="ar-JO"/>
               </w:rPr>
-              <w:t xml:space="preserve">to integrate bank account of the user , so that to somehow make a fake account with fake money, and then </w:t>
+              <w:t xml:space="preserve">to integrate bank account of the </w:t>
+            </w:r>
+            <w:r>
+              <w:rPr>
+                <w:rFonts w:ascii="Arial Narrow" w:hAnsi="Arial Narrow"/>
+                <w:i/>
+                <w:iCs/>
+                <w:sz w:val="24"/>
+                <w:szCs w:val="24"/>
+                <w:lang w:bidi="ar-JO"/>
+              </w:rPr>
+              <w:t>user,</w:t>
+            </w:r>
+            <w:r>
+              <w:rPr>
+                <w:rFonts w:ascii="Arial Narrow" w:hAnsi="Arial Narrow"/>
+                <w:i/>
+                <w:iCs/>
+                <w:sz w:val="24"/>
+                <w:szCs w:val="24"/>
+                <w:lang w:bidi="ar-JO"/>
+              </w:rPr>
+              <w:t xml:space="preserve"> so that to somehow make a fake account with fake money, and then </w:t>
             </w:r>
             <w:r>
               <w:rPr>
@@ -856,8 +878,21 @@
                 <w:lang w:bidi="ar-JO"/>
               </w:rPr>
               <w:lastRenderedPageBreak/>
-              <w:t>the Platform should detect patterns in changing of the Account information and potentially sending alerts or emails to the user .</w:t>
-            </w:r>
+              <w:t xml:space="preserve">the Platform should detect patterns in changing of the Account information and potentially sending alerts or emails to the </w:t>
+            </w:r>
+            <w:proofErr w:type="gramStart"/>
+            <w:r>
+              <w:rPr>
+                <w:rFonts w:ascii="Arial Narrow" w:hAnsi="Arial Narrow"/>
+                <w:i/>
+                <w:iCs/>
+                <w:sz w:val="24"/>
+                <w:szCs w:val="24"/>
+                <w:lang w:bidi="ar-JO"/>
+              </w:rPr>
+              <w:t>user .</w:t>
+            </w:r>
+            <w:proofErr w:type="gramEnd"/>
           </w:p>
           <w:p>
             <w:pPr>
@@ -1237,73 +1272,7 @@
                 <w:szCs w:val="24"/>
                 <w:lang w:bidi="ar-JO"/>
               </w:rPr>
-              <w:t xml:space="preserve"> if the </w:t>
-            </w:r>
-            <w:r>
-              <w:rPr>
-                <w:rFonts w:ascii="Arial Narrow" w:hAnsi="Arial Narrow"/>
-                <w:i/>
-                <w:iCs/>
-                <w:sz w:val="24"/>
-                <w:szCs w:val="24"/>
-                <w:lang w:bidi="ar-JO"/>
-              </w:rPr>
-              <w:t>‘Save and Continue’</w:t>
-            </w:r>
-            <w:r>
-              <w:rPr>
-                <w:rFonts w:ascii="Arial Narrow" w:hAnsi="Arial Narrow"/>
-                <w:i/>
-                <w:iCs/>
-                <w:sz w:val="24"/>
-                <w:szCs w:val="24"/>
-                <w:lang w:bidi="ar-JO"/>
-              </w:rPr>
-              <w:t xml:space="preserve"> button is pressed and the user already has account but it happened that he is logged out , the Login Page should be shown , in either successful Signup or Successful Login , some interface must be shown , let’s call it ‘DashBoard1’, if </w:t>
-            </w:r>
-            <w:r>
-              <w:rPr>
-                <w:rFonts w:ascii="Arial Narrow" w:hAnsi="Arial Narrow"/>
-                <w:i/>
-                <w:iCs/>
-                <w:sz w:val="24"/>
-                <w:szCs w:val="24"/>
-                <w:lang w:bidi="ar-JO"/>
-              </w:rPr>
-              <w:t>‘DashBoard1’</w:t>
-            </w:r>
-            <w:r>
-              <w:rPr>
-                <w:rFonts w:ascii="Arial Narrow" w:hAnsi="Arial Narrow"/>
-                <w:i/>
-                <w:iCs/>
-                <w:sz w:val="24"/>
-                <w:szCs w:val="24"/>
-                <w:lang w:bidi="ar-JO"/>
-              </w:rPr>
-              <w:t xml:space="preserve"> is  managed to be shown, then that means the System reached the </w:t>
-            </w:r>
-            <w:r>
-              <w:rPr>
-                <w:rFonts w:ascii="Arial Narrow" w:hAnsi="Arial Narrow"/>
-                <w:i/>
-                <w:iCs/>
-                <w:sz w:val="24"/>
-                <w:szCs w:val="24"/>
-                <w:lang w:bidi="ar-JO"/>
-              </w:rPr>
-              <w:t>“Full service”</w:t>
-            </w:r>
-            <w:r>
-              <w:rPr>
-                <w:rFonts w:ascii="Arial Narrow" w:hAnsi="Arial Narrow"/>
-                <w:i/>
-                <w:iCs/>
-                <w:sz w:val="24"/>
-                <w:szCs w:val="24"/>
-                <w:lang w:bidi="ar-JO"/>
-              </w:rPr>
-              <w:t xml:space="preserve"> case or mode.</w:t>
+              <w:t xml:space="preserve"> if the ‘Save and Continue’ button is pressed and the user already has account but it happened that he is logged out , the Login Page should be shown , in either successful Signup or Successful Login , some interface must be shown , let’s call it ‘DashBoard1’, if ‘DashBoard1’ is  managed to be shown, then that means the System reached the “Full service” case or mode.</w:t>
             </w:r>
           </w:p>
           <w:p>
@@ -1331,29 +1300,7 @@
                 <w:szCs w:val="24"/>
                 <w:lang w:bidi="ar-JO"/>
               </w:rPr>
-              <w:t>For the “</w:t>
-            </w:r>
-            <w:r>
-              <w:rPr>
-                <w:rFonts w:ascii="Arial Narrow" w:hAnsi="Arial Narrow"/>
-                <w:i/>
-                <w:iCs/>
-                <w:sz w:val="24"/>
-                <w:szCs w:val="24"/>
-                <w:lang w:bidi="ar-JO"/>
-              </w:rPr>
-              <w:t>Full service”</w:t>
-            </w:r>
-            <w:r>
-              <w:rPr>
-                <w:rFonts w:ascii="Arial Narrow" w:hAnsi="Arial Narrow"/>
-                <w:i/>
-                <w:iCs/>
-                <w:sz w:val="24"/>
-                <w:szCs w:val="24"/>
-                <w:lang w:bidi="ar-JO"/>
-              </w:rPr>
-              <w:t xml:space="preserve"> mode or </w:t>
+              <w:t xml:space="preserve">For the “Full service” mode or </w:t>
             </w:r>
             <w:r>
               <w:rPr>
@@ -1375,34 +1322,49 @@
                 <w:szCs w:val="24"/>
                 <w:lang w:bidi="ar-JO"/>
               </w:rPr>
-              <w:t xml:space="preserve"> it will be planned for </w:t>
-            </w:r>
-            <w:r>
-              <w:rPr>
-                <w:rFonts w:ascii="Arial Narrow" w:hAnsi="Arial Narrow"/>
-                <w:i/>
-                <w:iCs/>
-                <w:sz w:val="24"/>
-                <w:szCs w:val="24"/>
-                <w:lang w:bidi="ar-JO"/>
-              </w:rPr>
-              <w:t>later,</w:t>
-            </w:r>
-            <w:r>
-              <w:rPr>
-                <w:rFonts w:ascii="Arial Narrow" w:hAnsi="Arial Narrow"/>
-                <w:i/>
-                <w:iCs/>
-                <w:sz w:val="24"/>
-                <w:szCs w:val="24"/>
-                <w:lang w:bidi="ar-JO"/>
-              </w:rPr>
-              <w:t xml:space="preserve"> planning did not finish yet for this mode.</w:t>
+              <w:t xml:space="preserve"> </w:t>
+            </w:r>
+            <w:r>
+              <w:rPr>
+                <w:rFonts w:ascii="Arial Narrow" w:hAnsi="Arial Narrow"/>
+                <w:i/>
+                <w:iCs/>
+                <w:sz w:val="24"/>
+                <w:szCs w:val="24"/>
+                <w:lang w:bidi="ar-JO"/>
+              </w:rPr>
+              <w:t xml:space="preserve">it will cover two </w:t>
+            </w:r>
+            <w:r>
+              <w:rPr>
+                <w:rFonts w:ascii="Arial Narrow" w:hAnsi="Arial Narrow"/>
+                <w:i/>
+                <w:iCs/>
+                <w:sz w:val="24"/>
+                <w:szCs w:val="24"/>
+                <w:lang w:bidi="ar-JO"/>
+              </w:rPr>
+              <w:t>services,</w:t>
+            </w:r>
+            <w:r>
+              <w:rPr>
+                <w:rFonts w:ascii="Arial Narrow" w:hAnsi="Arial Narrow"/>
+                <w:i/>
+                <w:iCs/>
+                <w:sz w:val="24"/>
+                <w:szCs w:val="24"/>
+                <w:lang w:bidi="ar-JO"/>
+              </w:rPr>
+              <w:t xml:space="preserve"> they are described as follows:</w:t>
             </w:r>
           </w:p>
           <w:p>
             <w:pPr>
-              <w:ind w:left="360"/>
+              <w:pStyle w:val="ListParagraph"/>
+              <w:numPr>
+                <w:ilvl w:val="0"/>
+                <w:numId w:val="38"/>
+              </w:numPr>
               <w:rPr>
                 <w:rFonts w:ascii="Arial Narrow" w:hAnsi="Arial Narrow"/>
                 <w:i/>
@@ -1421,8 +1383,72 @@
                 <w:szCs w:val="24"/>
                 <w:lang w:bidi="ar-JO"/>
               </w:rPr>
-              <w:t xml:space="preserve"> </w:t>
-            </w:r>
+              <w:t xml:space="preserve">What-if simulation service: </w:t>
+            </w:r>
+            <w:r>
+              <w:rPr>
+                <w:rFonts w:ascii="Arial Narrow" w:hAnsi="Arial Narrow"/>
+                <w:i/>
+                <w:iCs/>
+                <w:sz w:val="24"/>
+                <w:szCs w:val="24"/>
+                <w:lang w:bidi="ar-JO"/>
+              </w:rPr>
+              <w:t>&lt;Describe here&gt;</w:t>
+            </w:r>
+          </w:p>
+          <w:p>
+            <w:pPr>
+              <w:pStyle w:val="ListParagraph"/>
+              <w:numPr>
+                <w:ilvl w:val="0"/>
+                <w:numId w:val="38"/>
+              </w:numPr>
+              <w:rPr>
+                <w:rFonts w:ascii="Arial Narrow" w:hAnsi="Arial Narrow"/>
+                <w:i/>
+                <w:iCs/>
+                <w:sz w:val="24"/>
+                <w:szCs w:val="24"/>
+                <w:lang w:bidi="ar-JO"/>
+              </w:rPr>
+            </w:pPr>
+            <w:r>
+              <w:rPr>
+                <w:rFonts w:ascii="Arial Narrow" w:hAnsi="Arial Narrow"/>
+                <w:i/>
+                <w:iCs/>
+                <w:sz w:val="24"/>
+                <w:szCs w:val="24"/>
+                <w:lang w:bidi="ar-JO"/>
+              </w:rPr>
+              <w:t xml:space="preserve">Continuous monitoring and alerts: </w:t>
+            </w:r>
+            <w:r>
+              <w:rPr>
+                <w:rFonts w:ascii="Arial Narrow" w:hAnsi="Arial Narrow"/>
+                <w:i/>
+                <w:iCs/>
+                <w:sz w:val="24"/>
+                <w:szCs w:val="24"/>
+                <w:lang w:bidi="ar-JO"/>
+              </w:rPr>
+              <w:t>&lt;Describe here&gt;</w:t>
+            </w:r>
+          </w:p>
+          <w:p>
+            <w:pPr>
+              <w:pStyle w:val="ListParagraph"/>
+              <w:ind w:left="1140"/>
+              <w:rPr>
+                <w:rFonts w:ascii="Arial Narrow" w:hAnsi="Arial Narrow"/>
+                <w:i/>
+                <w:iCs/>
+                <w:sz w:val="24"/>
+                <w:szCs w:val="24"/>
+                <w:lang w:bidi="ar-JO"/>
+              </w:rPr>
+            </w:pPr>
           </w:p>
           <w:p>
             <w:pPr>
@@ -1546,6 +1572,17 @@
                 <w:szCs w:val="24"/>
                 <w:lang w:bidi="ar-JO"/>
               </w:rPr>
+              <w:t xml:space="preserve">Continuously </w:t>
+            </w:r>
+            <w:r>
+              <w:rPr>
+                <w:rFonts w:ascii="Arial Narrow" w:hAnsi="Arial Narrow"/>
+                <w:i/>
+                <w:iCs/>
+                <w:sz w:val="24"/>
+                <w:szCs w:val="24"/>
+                <w:lang w:bidi="ar-JO"/>
+              </w:rPr>
               <w:t>Monitor goal progress and detect unusual trends</w:t>
             </w:r>
           </w:p>
@@ -1671,6 +1708,37 @@
           </w:p>
           <w:p>
             <w:pPr>
+              <w:pStyle w:val="ListParagraph"/>
+              <w:numPr>
+                <w:ilvl w:val="0"/>
+                <w:numId w:val="30"/>
+              </w:numPr>
+              <w:jc w:val="both"/>
+              <w:rPr>
+                <w:rFonts w:ascii="Arial Narrow" w:hAnsi="Arial Narrow"/>
+                <w:i/>
+                <w:iCs/>
+                <w:sz w:val="24"/>
+                <w:szCs w:val="24"/>
+                <w:lang w:bidi="ar-JO"/>
+              </w:rPr>
+            </w:pPr>
+            <w:r>
+              <w:rPr>
+                <w:rFonts w:ascii="Arial Narrow" w:hAnsi="Arial Narrow"/>
+                <w:i/>
+                <w:iCs/>
+                <w:sz w:val="24"/>
+                <w:szCs w:val="24"/>
+                <w:lang w:bidi="ar-JO"/>
+              </w:rPr>
+              <w:lastRenderedPageBreak/>
+              <w:t>What-if simulation</w:t>
+            </w:r>
+          </w:p>
+          <w:p>
+            <w:pPr>
+              <w:pStyle w:val="ListParagraph"/>
               <w:jc w:val="both"/>
               <w:rPr>
                 <w:rFonts w:ascii="Arial Narrow" w:hAnsi="Arial Narrow"/>
@@ -1684,10 +1752,9 @@
           </w:p>
           <w:p>
             <w:pPr>
-              <w:rPr>
-                <w:rFonts w:ascii="Arial Narrow" w:hAnsi="Arial Narrow"/>
-                <w:b/>
-                <w:bCs/>
+              <w:jc w:val="both"/>
+              <w:rPr>
+                <w:rFonts w:ascii="Arial Narrow" w:hAnsi="Arial Narrow"/>
                 <w:i/>
                 <w:iCs/>
                 <w:sz w:val="24"/>
@@ -1695,332 +1762,6 @@
                 <w:lang w:bidi="ar-JO"/>
               </w:rPr>
             </w:pPr>
-            <w:r>
-              <w:rPr>
-                <w:rFonts w:ascii="Arial Narrow" w:hAnsi="Arial Narrow"/>
-                <w:b/>
-                <w:bCs/>
-                <w:i/>
-                <w:iCs/>
-                <w:sz w:val="24"/>
-                <w:szCs w:val="24"/>
-                <w:lang w:bidi="ar-JO"/>
-              </w:rPr>
-              <w:t>Similar Applications and Comparison</w:t>
-            </w:r>
-          </w:p>
-          <w:p>
-            <w:pPr>
-              <w:rPr>
-                <w:rFonts w:ascii="Arial Narrow" w:hAnsi="Arial Narrow"/>
-                <w:b/>
-                <w:bCs/>
-                <w:i/>
-                <w:iCs/>
-                <w:sz w:val="24"/>
-                <w:szCs w:val="24"/>
-                <w:lang w:bidi="ar-JO"/>
-              </w:rPr>
-            </w:pPr>
-            <w:r>
-              <w:rPr>
-                <w:rFonts w:ascii="Arial Narrow" w:hAnsi="Arial Narrow"/>
-                <w:b/>
-                <w:bCs/>
-                <w:i/>
-                <w:iCs/>
-                <w:sz w:val="24"/>
-                <w:szCs w:val="24"/>
-                <w:lang w:bidi="ar-JO"/>
-              </w:rPr>
-              <w:t xml:space="preserve">      </w:t>
-            </w:r>
-          </w:p>
-          <w:p>
-            <w:pPr>
-              <w:rPr>
-                <w:rFonts w:ascii="Arial Narrow" w:hAnsi="Arial Narrow"/>
-                <w:i/>
-                <w:iCs/>
-                <w:sz w:val="24"/>
-                <w:szCs w:val="24"/>
-                <w:lang w:bidi="ar-JO"/>
-              </w:rPr>
-            </w:pPr>
-            <w:r>
-              <w:rPr>
-                <w:rFonts w:ascii="Arial Narrow" w:hAnsi="Arial Narrow"/>
-                <w:b/>
-                <w:bCs/>
-                <w:i/>
-                <w:iCs/>
-                <w:sz w:val="24"/>
-                <w:szCs w:val="24"/>
-                <w:lang w:bidi="ar-JO"/>
-              </w:rPr>
-              <w:lastRenderedPageBreak/>
-              <w:t xml:space="preserve">      </w:t>
-            </w:r>
-            <w:r>
-              <w:rPr>
-                <w:rFonts w:ascii="Arial Narrow" w:hAnsi="Arial Narrow"/>
-                <w:b/>
-                <w:bCs/>
-                <w:i/>
-                <w:iCs/>
-                <w:sz w:val="24"/>
-                <w:szCs w:val="24"/>
-                <w:lang w:bidi="ar-JO"/>
-              </w:rPr>
-              <w:t xml:space="preserve"> </w:t>
-            </w:r>
-            <w:r>
-              <w:rPr>
-                <w:rFonts w:ascii="Arial Narrow" w:hAnsi="Arial Narrow"/>
-                <w:b/>
-                <w:bCs/>
-                <w:i/>
-                <w:iCs/>
-                <w:sz w:val="24"/>
-                <w:szCs w:val="24"/>
-                <w:lang w:bidi="ar-JO"/>
-              </w:rPr>
-              <w:t>•</w:t>
-            </w:r>
-            <w:r>
-              <w:rPr>
-                <w:rFonts w:ascii="Arial Narrow" w:hAnsi="Arial Narrow"/>
-                <w:b/>
-                <w:bCs/>
-                <w:i/>
-                <w:iCs/>
-                <w:sz w:val="24"/>
-                <w:szCs w:val="24"/>
-                <w:lang w:bidi="ar-JO"/>
-              </w:rPr>
-              <w:t xml:space="preserve">     </w:t>
-            </w:r>
-            <w:r>
-              <w:rPr>
-                <w:rFonts w:ascii="Arial Narrow" w:hAnsi="Arial Narrow"/>
-                <w:i/>
-                <w:iCs/>
-                <w:sz w:val="24"/>
-                <w:szCs w:val="24"/>
-                <w:lang w:bidi="ar-JO"/>
-              </w:rPr>
-              <w:t>Cleo: chat-based assistant, focuses on polished interface with mostly</w:t>
-            </w:r>
-          </w:p>
-          <w:p>
-            <w:pPr>
-              <w:rPr>
-                <w:rFonts w:ascii="Arial Narrow" w:hAnsi="Arial Narrow"/>
-                <w:i/>
-                <w:iCs/>
-                <w:sz w:val="24"/>
-                <w:szCs w:val="24"/>
-                <w:lang w:bidi="ar-JO"/>
-              </w:rPr>
-            </w:pPr>
-            <w:r>
-              <w:rPr>
-                <w:rFonts w:ascii="Arial Narrow" w:hAnsi="Arial Narrow"/>
-                <w:i/>
-                <w:iCs/>
-                <w:sz w:val="24"/>
-                <w:szCs w:val="24"/>
-                <w:lang w:bidi="ar-JO"/>
-              </w:rPr>
-              <w:t xml:space="preserve">             rule -based alerts, our app has simplified interface but technically</w:t>
-            </w:r>
-          </w:p>
-          <w:p>
-            <w:pPr>
-              <w:rPr>
-                <w:rFonts w:ascii="Arial Narrow" w:hAnsi="Arial Narrow"/>
-                <w:i/>
-                <w:iCs/>
-                <w:sz w:val="24"/>
-                <w:szCs w:val="24"/>
-                <w:lang w:bidi="ar-JO"/>
-              </w:rPr>
-            </w:pPr>
-            <w:r>
-              <w:rPr>
-                <w:rFonts w:ascii="Arial Narrow" w:hAnsi="Arial Narrow"/>
-                <w:i/>
-                <w:iCs/>
-                <w:sz w:val="24"/>
-                <w:szCs w:val="24"/>
-                <w:lang w:bidi="ar-JO"/>
-              </w:rPr>
-              <w:t xml:space="preserve">             harder</w:t>
-            </w:r>
-            <w:r>
-              <w:rPr>
-                <w:rFonts w:ascii="Arial Narrow" w:hAnsi="Arial Narrow"/>
-                <w:i/>
-                <w:iCs/>
-                <w:sz w:val="24"/>
-                <w:szCs w:val="24"/>
-                <w:lang w:bidi="ar-JO"/>
-              </w:rPr>
-              <w:t xml:space="preserve"> due to the overhead generating clever, context-aware alerts</w:t>
-            </w:r>
-          </w:p>
-          <w:p>
-            <w:pPr>
-              <w:rPr>
-                <w:rFonts w:ascii="Arial Narrow" w:hAnsi="Arial Narrow"/>
-                <w:i/>
-                <w:iCs/>
-                <w:sz w:val="24"/>
-                <w:szCs w:val="24"/>
-                <w:lang w:bidi="ar-JO"/>
-              </w:rPr>
-            </w:pPr>
-            <w:r>
-              <w:rPr>
-                <w:rFonts w:ascii="Arial Narrow" w:hAnsi="Arial Narrow"/>
-                <w:i/>
-                <w:iCs/>
-                <w:sz w:val="24"/>
-                <w:szCs w:val="24"/>
-                <w:lang w:bidi="ar-JO"/>
-              </w:rPr>
-              <w:t xml:space="preserve">       </w:t>
-            </w:r>
-          </w:p>
-          <w:p>
-            <w:pPr>
-              <w:rPr>
-                <w:rFonts w:ascii="Arial Narrow" w:hAnsi="Arial Narrow"/>
-                <w:i/>
-                <w:iCs/>
-                <w:sz w:val="24"/>
-                <w:szCs w:val="24"/>
-                <w:lang w:bidi="ar-JO"/>
-              </w:rPr>
-            </w:pPr>
-            <w:r>
-              <w:rPr>
-                <w:rFonts w:ascii="Arial Narrow" w:hAnsi="Arial Narrow"/>
-                <w:b/>
-                <w:bCs/>
-                <w:i/>
-                <w:iCs/>
-                <w:sz w:val="24"/>
-                <w:szCs w:val="24"/>
-                <w:lang w:bidi="ar-JO"/>
-              </w:rPr>
-              <w:t xml:space="preserve">      </w:t>
-            </w:r>
-            <w:r>
-              <w:rPr>
-                <w:rFonts w:ascii="Arial Narrow" w:hAnsi="Arial Narrow"/>
-                <w:b/>
-                <w:bCs/>
-                <w:i/>
-                <w:iCs/>
-                <w:sz w:val="24"/>
-                <w:szCs w:val="24"/>
-                <w:lang w:bidi="ar-JO"/>
-              </w:rPr>
-              <w:t>•</w:t>
-            </w:r>
-            <w:r>
-              <w:rPr>
-                <w:rFonts w:ascii="Arial Narrow" w:hAnsi="Arial Narrow"/>
-                <w:b/>
-                <w:bCs/>
-                <w:i/>
-                <w:iCs/>
-                <w:sz w:val="24"/>
-                <w:szCs w:val="24"/>
-                <w:lang w:bidi="ar-JO"/>
-              </w:rPr>
-              <w:t xml:space="preserve">    </w:t>
-            </w:r>
-            <w:r>
-              <w:rPr>
-                <w:rFonts w:ascii="Arial Narrow" w:hAnsi="Arial Narrow"/>
-                <w:i/>
-                <w:iCs/>
-                <w:sz w:val="24"/>
-                <w:szCs w:val="24"/>
-                <w:lang w:bidi="ar-JO"/>
-              </w:rPr>
-              <w:t>FinantialAdvisorGPT:</w:t>
-            </w:r>
-            <w:r>
-              <w:rPr>
-                <w:rFonts w:ascii="Arial Narrow" w:hAnsi="Arial Narrow"/>
-                <w:i/>
-                <w:iCs/>
-                <w:sz w:val="24"/>
-                <w:szCs w:val="24"/>
-                <w:lang w:bidi="ar-JO"/>
-              </w:rPr>
-              <w:t xml:space="preserve"> gives a finance advice based on document </w:t>
-            </w:r>
-          </w:p>
-          <w:p>
-            <w:pPr>
-              <w:rPr>
-                <w:rFonts w:ascii="Arial Narrow" w:hAnsi="Arial Narrow"/>
-                <w:i/>
-                <w:iCs/>
-                <w:sz w:val="24"/>
-                <w:szCs w:val="24"/>
-                <w:lang w:bidi="ar-JO"/>
-              </w:rPr>
-            </w:pPr>
-            <w:r>
-              <w:rPr>
-                <w:rFonts w:ascii="Arial Narrow" w:hAnsi="Arial Narrow"/>
-                <w:i/>
-                <w:iCs/>
-                <w:sz w:val="24"/>
-                <w:szCs w:val="24"/>
-                <w:lang w:bidi="ar-JO"/>
-              </w:rPr>
-              <w:t xml:space="preserve">           </w:t>
-            </w:r>
-            <w:r>
-              <w:rPr>
-                <w:rFonts w:ascii="Arial Narrow" w:hAnsi="Arial Narrow"/>
-                <w:i/>
-                <w:iCs/>
-                <w:sz w:val="24"/>
-                <w:szCs w:val="24"/>
-                <w:lang w:bidi="ar-JO"/>
-              </w:rPr>
-              <w:t>retrieval, our solution is personalized and context-aware, not just</w:t>
-            </w:r>
-          </w:p>
-          <w:p>
-            <w:pPr>
-              <w:rPr>
-                <w:rFonts w:ascii="Arial Narrow" w:hAnsi="Arial Narrow"/>
-                <w:i/>
-                <w:iCs/>
-                <w:sz w:val="24"/>
-                <w:szCs w:val="24"/>
-                <w:lang w:bidi="ar-JO"/>
-              </w:rPr>
-            </w:pPr>
-            <w:r>
-              <w:rPr>
-                <w:rFonts w:ascii="Arial Narrow" w:hAnsi="Arial Narrow"/>
-                <w:i/>
-                <w:iCs/>
-                <w:sz w:val="24"/>
-                <w:szCs w:val="24"/>
-                <w:lang w:bidi="ar-JO"/>
-              </w:rPr>
-              <w:t xml:space="preserve">          a document-driven </w:t>
-            </w:r>
           </w:p>
           <w:p>
             <w:pPr>
@@ -2566,73 +2307,7 @@
                 <w:szCs w:val="24"/>
                 <w:lang w:bidi="ar-JO"/>
               </w:rPr>
-              <w:t xml:space="preserve"> LangGraph, </w:t>
-            </w:r>
-            <w:r>
-              <w:rPr>
-                <w:rFonts w:ascii="Arial Narrow" w:hAnsi="Arial Narrow"/>
-                <w:i/>
-                <w:iCs/>
-                <w:sz w:val="24"/>
-                <w:szCs w:val="24"/>
-                <w:lang w:bidi="ar-JO"/>
-              </w:rPr>
-              <w:t>FastAPI</w:t>
-            </w:r>
-            <w:r>
-              <w:rPr>
-                <w:rFonts w:ascii="Arial Narrow" w:hAnsi="Arial Narrow"/>
-                <w:i/>
-                <w:iCs/>
-                <w:sz w:val="24"/>
-                <w:szCs w:val="24"/>
-                <w:lang w:bidi="ar-JO"/>
-              </w:rPr>
-              <w:t xml:space="preserve">, </w:t>
-            </w:r>
-            <w:r>
-              <w:rPr>
-                <w:rFonts w:ascii="Arial Narrow" w:hAnsi="Arial Narrow"/>
-                <w:i/>
-                <w:iCs/>
-                <w:sz w:val="24"/>
-                <w:szCs w:val="24"/>
-                <w:lang w:bidi="ar-JO"/>
-              </w:rPr>
-              <w:t>PostgreSQL</w:t>
-            </w:r>
-            <w:r>
-              <w:rPr>
-                <w:rFonts w:ascii="Arial Narrow" w:hAnsi="Arial Narrow"/>
-                <w:i/>
-                <w:iCs/>
-                <w:sz w:val="24"/>
-                <w:szCs w:val="24"/>
-                <w:lang w:bidi="ar-JO"/>
-              </w:rPr>
-              <w:t xml:space="preserve">, </w:t>
-            </w:r>
-            <w:r>
-              <w:rPr>
-                <w:rFonts w:ascii="Arial Narrow" w:hAnsi="Arial Narrow"/>
-                <w:i/>
-                <w:iCs/>
-                <w:sz w:val="24"/>
-                <w:szCs w:val="24"/>
-                <w:lang w:bidi="ar-JO"/>
-              </w:rPr>
-              <w:t>React</w:t>
-            </w:r>
-            <w:r>
-              <w:rPr>
-                <w:rFonts w:ascii="Arial Narrow" w:hAnsi="Arial Narrow"/>
-                <w:i/>
-                <w:iCs/>
-                <w:sz w:val="24"/>
-                <w:szCs w:val="24"/>
-                <w:lang w:bidi="ar-JO"/>
-              </w:rPr>
-              <w:t xml:space="preserve">. </w:t>
+              <w:t xml:space="preserve"> LangGraph, FastAPI, PostgreSQL, React. </w:t>
             </w:r>
           </w:p>
         </w:tc>
@@ -3176,29 +2851,7 @@
                 <w:szCs w:val="24"/>
                 <w:lang w:bidi="ar-JO"/>
               </w:rPr>
-              <w:t xml:space="preserve">Database: </w:t>
-            </w:r>
-            <w:r>
-              <w:rPr>
-                <w:rFonts w:ascii="Arial Narrow" w:hAnsi="Arial Narrow"/>
-                <w:i/>
-                <w:iCs/>
-                <w:sz w:val="24"/>
-                <w:szCs w:val="24"/>
-                <w:lang w:bidi="ar-JO"/>
-              </w:rPr>
-              <w:t>PostgreSQL</w:t>
-            </w:r>
-            <w:r>
-              <w:rPr>
-                <w:rFonts w:ascii="Arial Narrow" w:hAnsi="Arial Narrow"/>
-                <w:i/>
-                <w:iCs/>
-                <w:sz w:val="24"/>
-                <w:szCs w:val="24"/>
-                <w:lang w:bidi="ar-JO"/>
-              </w:rPr>
-              <w:t>.</w:t>
+              <w:t>Database: PostgreSQL.</w:t>
             </w:r>
           </w:p>
           <w:p>
@@ -5908,6 +5561,119 @@
     </w:lvl>
   </w:abstractNum>
   <w:abstractNum w:abstractNumId="18" w15:restartNumberingAfterBreak="0">
+    <w:nsid w:val="571D4D5E"/>
+    <w:multiLevelType w:val="hybridMultilevel"/>
+    <w:tmpl w:val="C9C418F4"/>
+    <w:lvl w:ilvl="0" w:tplc="04090001">
+      <w:start w:val="1"/>
+      <w:numFmt w:val="bullet"/>
+      <w:lvlText w:val=""/>
+      <w:lvlJc w:val="left"/>
+      <w:pPr>
+        <w:ind w:left="1440" w:hanging="360"/>
+      </w:pPr>
+      <w:rPr>
+        <w:rFonts w:ascii="Symbol" w:hAnsi="Symbol" w:hint="default"/>
+      </w:rPr>
+    </w:lvl>
+    <w:lvl w:ilvl="1" w:tplc="04090003" w:tentative="1">
+      <w:start w:val="1"/>
+      <w:numFmt w:val="bullet"/>
+      <w:lvlText w:val="o"/>
+      <w:lvlJc w:val="left"/>
+      <w:pPr>
+        <w:ind w:left="2160" w:hanging="360"/>
+      </w:pPr>
+      <w:rPr>
+        <w:rFonts w:ascii="Courier New" w:hAnsi="Courier New" w:cs="Courier New" w:hint="default"/>
+      </w:rPr>
+    </w:lvl>
+    <w:lvl w:ilvl="2" w:tplc="04090005" w:tentative="1">
+      <w:start w:val="1"/>
+      <w:numFmt w:val="bullet"/>
+      <w:lvlText w:val=""/>
+      <w:lvlJc w:val="left"/>
+      <w:pPr>
+        <w:ind w:left="2880" w:hanging="360"/>
+      </w:pPr>
+      <w:rPr>
+        <w:rFonts w:ascii="Wingdings" w:hAnsi="Wingdings" w:hint="default"/>
+      </w:rPr>
+    </w:lvl>
+    <w:lvl w:ilvl="3" w:tplc="04090001" w:tentative="1">
+      <w:start w:val="1"/>
+      <w:numFmt w:val="bullet"/>
+      <w:lvlText w:val=""/>
+      <w:lvlJc w:val="left"/>
+      <w:pPr>
+        <w:ind w:left="3600" w:hanging="360"/>
+      </w:pPr>
+      <w:rPr>
+        <w:rFonts w:ascii="Symbol" w:hAnsi="Symbol" w:hint="default"/>
+      </w:rPr>
+    </w:lvl>
+    <w:lvl w:ilvl="4" w:tplc="04090003" w:tentative="1">
+      <w:start w:val="1"/>
+      <w:numFmt w:val="bullet"/>
+      <w:lvlText w:val="o"/>
+      <w:lvlJc w:val="left"/>
+      <w:pPr>
+        <w:ind w:left="4320" w:hanging="360"/>
+      </w:pPr>
+      <w:rPr>
+        <w:rFonts w:ascii="Courier New" w:hAnsi="Courier New" w:cs="Courier New" w:hint="default"/>
+      </w:rPr>
+    </w:lvl>
+    <w:lvl w:ilvl="5" w:tplc="04090005" w:tentative="1">
+      <w:start w:val="1"/>
+      <w:numFmt w:val="bullet"/>
+      <w:lvlText w:val=""/>
+      <w:lvlJc w:val="left"/>
+      <w:pPr>
+        <w:ind w:left="5040" w:hanging="360"/>
+      </w:pPr>
+      <w:rPr>
+        <w:rFonts w:ascii="Wingdings" w:hAnsi="Wingdings" w:hint="default"/>
+      </w:rPr>
+    </w:lvl>
+    <w:lvl w:ilvl="6" w:tplc="04090001" w:tentative="1">
+      <w:start w:val="1"/>
+      <w:numFmt w:val="bullet"/>
+      <w:lvlText w:val=""/>
+      <w:lvlJc w:val="left"/>
+      <w:pPr>
+        <w:ind w:left="5760" w:hanging="360"/>
+      </w:pPr>
+      <w:rPr>
+        <w:rFonts w:ascii="Symbol" w:hAnsi="Symbol" w:hint="default"/>
+      </w:rPr>
+    </w:lvl>
+    <w:lvl w:ilvl="7" w:tplc="04090003" w:tentative="1">
+      <w:start w:val="1"/>
+      <w:numFmt w:val="bullet"/>
+      <w:lvlText w:val="o"/>
+      <w:lvlJc w:val="left"/>
+      <w:pPr>
+        <w:ind w:left="6480" w:hanging="360"/>
+      </w:pPr>
+      <w:rPr>
+        <w:rFonts w:ascii="Courier New" w:hAnsi="Courier New" w:cs="Courier New" w:hint="default"/>
+      </w:rPr>
+    </w:lvl>
+    <w:lvl w:ilvl="8" w:tplc="04090005" w:tentative="1">
+      <w:start w:val="1"/>
+      <w:numFmt w:val="bullet"/>
+      <w:lvlText w:val=""/>
+      <w:lvlJc w:val="left"/>
+      <w:pPr>
+        <w:ind w:left="7200" w:hanging="360"/>
+      </w:pPr>
+      <w:rPr>
+        <w:rFonts w:ascii="Wingdings" w:hAnsi="Wingdings" w:hint="default"/>
+      </w:rPr>
+    </w:lvl>
+  </w:abstractNum>
+  <w:abstractNum w:abstractNumId="19" w15:restartNumberingAfterBreak="0">
     <w:nsid w:val="5E291C17"/>
     <w:multiLevelType w:val="hybridMultilevel"/>
     <w:tmpl w:val="FE209CCE"/>
@@ -6020,7 +5786,7 @@
       </w:rPr>
     </w:lvl>
   </w:abstractNum>
-  <w:abstractNum w:abstractNumId="19" w15:restartNumberingAfterBreak="0">
+  <w:abstractNum w:abstractNumId="20" w15:restartNumberingAfterBreak="0">
     <w:nsid w:val="5EFC4234"/>
     <w:multiLevelType w:val="multilevel"/>
     <w:tmpl w:val="33745FC0"/>
@@ -6169,7 +5935,7 @@
       </w:rPr>
     </w:lvl>
   </w:abstractNum>
-  <w:abstractNum w:abstractNumId="20" w15:restartNumberingAfterBreak="0">
+  <w:abstractNum w:abstractNumId="21" w15:restartNumberingAfterBreak="0">
     <w:nsid w:val="5F644B62"/>
     <w:multiLevelType w:val="multilevel"/>
     <w:tmpl w:val="435A4BA0"/>
@@ -6318,7 +6084,7 @@
       </w:rPr>
     </w:lvl>
   </w:abstractNum>
-  <w:abstractNum w:abstractNumId="21" w15:restartNumberingAfterBreak="0">
+  <w:abstractNum w:abstractNumId="22" w15:restartNumberingAfterBreak="0">
     <w:nsid w:val="5FD70394"/>
     <w:multiLevelType w:val="multilevel"/>
     <w:tmpl w:val="E62EF54E"/>
@@ -6467,7 +6233,7 @@
       </w:rPr>
     </w:lvl>
   </w:abstractNum>
-  <w:abstractNum w:abstractNumId="22" w15:restartNumberingAfterBreak="0">
+  <w:abstractNum w:abstractNumId="23" w15:restartNumberingAfterBreak="0">
     <w:nsid w:val="6150729F"/>
     <w:multiLevelType w:val="hybridMultilevel"/>
     <w:tmpl w:val="8AC8C198"/>
@@ -6580,7 +6346,7 @@
       </w:rPr>
     </w:lvl>
   </w:abstractNum>
-  <w:abstractNum w:abstractNumId="23" w15:restartNumberingAfterBreak="0">
+  <w:abstractNum w:abstractNumId="24" w15:restartNumberingAfterBreak="0">
     <w:nsid w:val="66A62CF8"/>
     <w:multiLevelType w:val="hybridMultilevel"/>
     <w:tmpl w:val="57ACCFD8"/>
@@ -6693,7 +6459,7 @@
       </w:rPr>
     </w:lvl>
   </w:abstractNum>
-  <w:abstractNum w:abstractNumId="24" w15:restartNumberingAfterBreak="0">
+  <w:abstractNum w:abstractNumId="25" w15:restartNumberingAfterBreak="0">
     <w:nsid w:val="671D01D0"/>
     <w:multiLevelType w:val="multilevel"/>
     <w:tmpl w:val="799005F6"/>
@@ -6842,7 +6608,7 @@
       </w:rPr>
     </w:lvl>
   </w:abstractNum>
-  <w:abstractNum w:abstractNumId="25" w15:restartNumberingAfterBreak="0">
+  <w:abstractNum w:abstractNumId="26" w15:restartNumberingAfterBreak="0">
     <w:nsid w:val="69744371"/>
     <w:multiLevelType w:val="hybridMultilevel"/>
     <w:tmpl w:val="FAB48194"/>
@@ -6955,7 +6721,7 @@
       </w:rPr>
     </w:lvl>
   </w:abstractNum>
-  <w:abstractNum w:abstractNumId="26" w15:restartNumberingAfterBreak="0">
+  <w:abstractNum w:abstractNumId="27" w15:restartNumberingAfterBreak="0">
     <w:nsid w:val="6B725516"/>
     <w:multiLevelType w:val="multilevel"/>
     <w:tmpl w:val="F2624B6A"/>
@@ -7104,7 +6870,7 @@
       </w:rPr>
     </w:lvl>
   </w:abstractNum>
-  <w:abstractNum w:abstractNumId="27" w15:restartNumberingAfterBreak="0">
+  <w:abstractNum w:abstractNumId="28" w15:restartNumberingAfterBreak="0">
     <w:nsid w:val="6D675BBA"/>
     <w:multiLevelType w:val="multilevel"/>
     <w:tmpl w:val="88ACB606"/>
@@ -7253,7 +7019,120 @@
       </w:rPr>
     </w:lvl>
   </w:abstractNum>
-  <w:abstractNum w:abstractNumId="28" w15:restartNumberingAfterBreak="0">
+  <w:abstractNum w:abstractNumId="29" w15:restartNumberingAfterBreak="0">
+    <w:nsid w:val="708B4735"/>
+    <w:multiLevelType w:val="hybridMultilevel"/>
+    <w:tmpl w:val="0C6AAC08"/>
+    <w:lvl w:ilvl="0" w:tplc="04090001">
+      <w:start w:val="1"/>
+      <w:numFmt w:val="bullet"/>
+      <w:lvlText w:val=""/>
+      <w:lvlJc w:val="left"/>
+      <w:pPr>
+        <w:ind w:left="1140" w:hanging="360"/>
+      </w:pPr>
+      <w:rPr>
+        <w:rFonts w:ascii="Symbol" w:hAnsi="Symbol" w:hint="default"/>
+      </w:rPr>
+    </w:lvl>
+    <w:lvl w:ilvl="1" w:tplc="04090003" w:tentative="1">
+      <w:start w:val="1"/>
+      <w:numFmt w:val="bullet"/>
+      <w:lvlText w:val="o"/>
+      <w:lvlJc w:val="left"/>
+      <w:pPr>
+        <w:ind w:left="1860" w:hanging="360"/>
+      </w:pPr>
+      <w:rPr>
+        <w:rFonts w:ascii="Courier New" w:hAnsi="Courier New" w:cs="Courier New" w:hint="default"/>
+      </w:rPr>
+    </w:lvl>
+    <w:lvl w:ilvl="2" w:tplc="04090005" w:tentative="1">
+      <w:start w:val="1"/>
+      <w:numFmt w:val="bullet"/>
+      <w:lvlText w:val=""/>
+      <w:lvlJc w:val="left"/>
+      <w:pPr>
+        <w:ind w:left="2580" w:hanging="360"/>
+      </w:pPr>
+      <w:rPr>
+        <w:rFonts w:ascii="Wingdings" w:hAnsi="Wingdings" w:hint="default"/>
+      </w:rPr>
+    </w:lvl>
+    <w:lvl w:ilvl="3" w:tplc="04090001" w:tentative="1">
+      <w:start w:val="1"/>
+      <w:numFmt w:val="bullet"/>
+      <w:lvlText w:val=""/>
+      <w:lvlJc w:val="left"/>
+      <w:pPr>
+        <w:ind w:left="3300" w:hanging="360"/>
+      </w:pPr>
+      <w:rPr>
+        <w:rFonts w:ascii="Symbol" w:hAnsi="Symbol" w:hint="default"/>
+      </w:rPr>
+    </w:lvl>
+    <w:lvl w:ilvl="4" w:tplc="04090003" w:tentative="1">
+      <w:start w:val="1"/>
+      <w:numFmt w:val="bullet"/>
+      <w:lvlText w:val="o"/>
+      <w:lvlJc w:val="left"/>
+      <w:pPr>
+        <w:ind w:left="4020" w:hanging="360"/>
+      </w:pPr>
+      <w:rPr>
+        <w:rFonts w:ascii="Courier New" w:hAnsi="Courier New" w:cs="Courier New" w:hint="default"/>
+      </w:rPr>
+    </w:lvl>
+    <w:lvl w:ilvl="5" w:tplc="04090005" w:tentative="1">
+      <w:start w:val="1"/>
+      <w:numFmt w:val="bullet"/>
+      <w:lvlText w:val=""/>
+      <w:lvlJc w:val="left"/>
+      <w:pPr>
+        <w:ind w:left="4740" w:hanging="360"/>
+      </w:pPr>
+      <w:rPr>
+        <w:rFonts w:ascii="Wingdings" w:hAnsi="Wingdings" w:hint="default"/>
+      </w:rPr>
+    </w:lvl>
+    <w:lvl w:ilvl="6" w:tplc="04090001" w:tentative="1">
+      <w:start w:val="1"/>
+      <w:numFmt w:val="bullet"/>
+      <w:lvlText w:val=""/>
+      <w:lvlJc w:val="left"/>
+      <w:pPr>
+        <w:ind w:left="5460" w:hanging="360"/>
+      </w:pPr>
+      <w:rPr>
+        <w:rFonts w:ascii="Symbol" w:hAnsi="Symbol" w:hint="default"/>
+      </w:rPr>
+    </w:lvl>
+    <w:lvl w:ilvl="7" w:tplc="04090003" w:tentative="1">
+      <w:start w:val="1"/>
+      <w:numFmt w:val="bullet"/>
+      <w:lvlText w:val="o"/>
+      <w:lvlJc w:val="left"/>
+      <w:pPr>
+        <w:ind w:left="6180" w:hanging="360"/>
+      </w:pPr>
+      <w:rPr>
+        <w:rFonts w:ascii="Courier New" w:hAnsi="Courier New" w:cs="Courier New" w:hint="default"/>
+      </w:rPr>
+    </w:lvl>
+    <w:lvl w:ilvl="8" w:tplc="04090005" w:tentative="1">
+      <w:start w:val="1"/>
+      <w:numFmt w:val="bullet"/>
+      <w:lvlText w:val=""/>
+      <w:lvlJc w:val="left"/>
+      <w:pPr>
+        <w:ind w:left="6900" w:hanging="360"/>
+      </w:pPr>
+      <w:rPr>
+        <w:rFonts w:ascii="Wingdings" w:hAnsi="Wingdings" w:hint="default"/>
+      </w:rPr>
+    </w:lvl>
+  </w:abstractNum>
+  <w:abstractNum w:abstractNumId="30" w15:restartNumberingAfterBreak="0">
     <w:nsid w:val="74202F16"/>
     <w:multiLevelType w:val="multilevel"/>
     <w:tmpl w:val="3B16221C"/>
@@ -7402,7 +7281,7 @@
       </w:rPr>
     </w:lvl>
   </w:abstractNum>
-  <w:abstractNum w:abstractNumId="29" w15:restartNumberingAfterBreak="0">
+  <w:abstractNum w:abstractNumId="31" w15:restartNumberingAfterBreak="0">
     <w:nsid w:val="74F528FB"/>
     <w:multiLevelType w:val="multilevel"/>
     <w:tmpl w:val="9CAAB638"/>
@@ -7551,7 +7430,7 @@
       </w:rPr>
     </w:lvl>
   </w:abstractNum>
-  <w:abstractNum w:abstractNumId="30" w15:restartNumberingAfterBreak="0">
+  <w:abstractNum w:abstractNumId="32" w15:restartNumberingAfterBreak="0">
     <w:nsid w:val="75656BE6"/>
     <w:multiLevelType w:val="hybridMultilevel"/>
     <w:tmpl w:val="413AA9F0"/>
@@ -7637,7 +7516,7 @@
       </w:pPr>
     </w:lvl>
   </w:abstractNum>
-  <w:abstractNum w:abstractNumId="31" w15:restartNumberingAfterBreak="0">
+  <w:abstractNum w:abstractNumId="33" w15:restartNumberingAfterBreak="0">
     <w:nsid w:val="762D6F8C"/>
     <w:multiLevelType w:val="hybridMultilevel"/>
     <w:tmpl w:val="7168FDB2"/>
@@ -7726,7 +7605,7 @@
       </w:pPr>
     </w:lvl>
   </w:abstractNum>
-  <w:abstractNum w:abstractNumId="32" w15:restartNumberingAfterBreak="0">
+  <w:abstractNum w:abstractNumId="34" w15:restartNumberingAfterBreak="0">
     <w:nsid w:val="779D11D0"/>
     <w:multiLevelType w:val="hybridMultilevel"/>
     <w:tmpl w:val="3118E690"/>
@@ -7815,7 +7694,7 @@
       </w:pPr>
     </w:lvl>
   </w:abstractNum>
-  <w:abstractNum w:abstractNumId="33" w15:restartNumberingAfterBreak="0">
+  <w:abstractNum w:abstractNumId="35" w15:restartNumberingAfterBreak="0">
     <w:nsid w:val="77FC5B4A"/>
     <w:multiLevelType w:val="hybridMultilevel"/>
     <w:tmpl w:val="C7048394"/>
@@ -7928,7 +7807,7 @@
       </w:rPr>
     </w:lvl>
   </w:abstractNum>
-  <w:abstractNum w:abstractNumId="34" w15:restartNumberingAfterBreak="0">
+  <w:abstractNum w:abstractNumId="36" w15:restartNumberingAfterBreak="0">
     <w:nsid w:val="7B7F086F"/>
     <w:multiLevelType w:val="multilevel"/>
     <w:tmpl w:val="7680AAB8"/>
@@ -8077,7 +7956,7 @@
       </w:rPr>
     </w:lvl>
   </w:abstractNum>
-  <w:abstractNum w:abstractNumId="35" w15:restartNumberingAfterBreak="0">
+  <w:abstractNum w:abstractNumId="37" w15:restartNumberingAfterBreak="0">
     <w:nsid w:val="7D17306B"/>
     <w:multiLevelType w:val="multilevel"/>
     <w:tmpl w:val="6CB019A2"/>
@@ -8227,16 +8106,16 @@
     </w:lvl>
   </w:abstractNum>
   <w:num w:numId="1" w16cid:durableId="283388493">
-    <w:abstractNumId w:val="32"/>
+    <w:abstractNumId w:val="34"/>
   </w:num>
   <w:num w:numId="2" w16cid:durableId="1180974328">
-    <w:abstractNumId w:val="23"/>
+    <w:abstractNumId w:val="24"/>
   </w:num>
   <w:num w:numId="3" w16cid:durableId="1941646935">
     <w:abstractNumId w:val="8"/>
   </w:num>
   <w:num w:numId="4" w16cid:durableId="1898935006">
-    <w:abstractNumId w:val="30"/>
+    <w:abstractNumId w:val="32"/>
   </w:num>
   <w:num w:numId="5" w16cid:durableId="208540098">
     <w:abstractNumId w:val="15"/>
@@ -8245,16 +8124,16 @@
     <w:abstractNumId w:val="5"/>
   </w:num>
   <w:num w:numId="7" w16cid:durableId="1935744618">
-    <w:abstractNumId w:val="34"/>
+    <w:abstractNumId w:val="36"/>
   </w:num>
   <w:num w:numId="8" w16cid:durableId="1888174969">
-    <w:abstractNumId w:val="35"/>
+    <w:abstractNumId w:val="37"/>
   </w:num>
   <w:num w:numId="9" w16cid:durableId="218634948">
     <w:abstractNumId w:val="6"/>
   </w:num>
   <w:num w:numId="10" w16cid:durableId="1354574204">
-    <w:abstractNumId w:val="27"/>
+    <w:abstractNumId w:val="28"/>
   </w:num>
   <w:num w:numId="11" w16cid:durableId="126247654">
     <w:abstractNumId w:val="9"/>
@@ -8263,7 +8142,7 @@
     <w:abstractNumId w:val="17"/>
   </w:num>
   <w:num w:numId="13" w16cid:durableId="1474639356">
-    <w:abstractNumId w:val="19"/>
+    <w:abstractNumId w:val="20"/>
   </w:num>
   <w:num w:numId="14" w16cid:durableId="840007154">
     <w:abstractNumId w:val="12"/>
@@ -8272,7 +8151,7 @@
     <w:abstractNumId w:val="0"/>
   </w:num>
   <w:num w:numId="16" w16cid:durableId="489753411">
-    <w:abstractNumId w:val="21"/>
+    <w:abstractNumId w:val="22"/>
   </w:num>
   <w:num w:numId="17" w16cid:durableId="513765401">
     <w:abstractNumId w:val="10"/>
@@ -8281,7 +8160,7 @@
     <w:abstractNumId w:val="7"/>
   </w:num>
   <w:num w:numId="19" w16cid:durableId="19549060">
-    <w:abstractNumId w:val="29"/>
+    <w:abstractNumId w:val="31"/>
   </w:num>
   <w:num w:numId="20" w16cid:durableId="1868061296">
     <w:abstractNumId w:val="13"/>
@@ -8290,16 +8169,16 @@
     <w:abstractNumId w:val="14"/>
   </w:num>
   <w:num w:numId="22" w16cid:durableId="1735664637">
-    <w:abstractNumId w:val="28"/>
+    <w:abstractNumId w:val="30"/>
   </w:num>
   <w:num w:numId="23" w16cid:durableId="1286275657">
-    <w:abstractNumId w:val="26"/>
+    <w:abstractNumId w:val="27"/>
   </w:num>
   <w:num w:numId="24" w16cid:durableId="131406531">
-    <w:abstractNumId w:val="24"/>
+    <w:abstractNumId w:val="25"/>
   </w:num>
   <w:num w:numId="25" w16cid:durableId="1342195951">
-    <w:abstractNumId w:val="20"/>
+    <w:abstractNumId w:val="21"/>
   </w:num>
   <w:num w:numId="26" w16cid:durableId="1733888811">
     <w:abstractNumId w:val="11"/>
@@ -8308,16 +8187,16 @@
     <w:abstractNumId w:val="4"/>
   </w:num>
   <w:num w:numId="28" w16cid:durableId="598754807">
-    <w:abstractNumId w:val="22"/>
+    <w:abstractNumId w:val="23"/>
   </w:num>
   <w:num w:numId="29" w16cid:durableId="732847819">
-    <w:abstractNumId w:val="25"/>
+    <w:abstractNumId w:val="26"/>
   </w:num>
   <w:num w:numId="30" w16cid:durableId="1746105994">
-    <w:abstractNumId w:val="18"/>
+    <w:abstractNumId w:val="19"/>
   </w:num>
   <w:num w:numId="31" w16cid:durableId="2124567133">
-    <w:abstractNumId w:val="33"/>
+    <w:abstractNumId w:val="35"/>
   </w:num>
   <w:num w:numId="32" w16cid:durableId="1919703828">
     <w:abstractNumId w:val="16"/>
@@ -8326,13 +8205,19 @@
     <w:abstractNumId w:val="1"/>
   </w:num>
   <w:num w:numId="34" w16cid:durableId="1687631720">
-    <w:abstractNumId w:val="31"/>
+    <w:abstractNumId w:val="33"/>
   </w:num>
   <w:num w:numId="35" w16cid:durableId="290063694">
     <w:abstractNumId w:val="2"/>
   </w:num>
   <w:num w:numId="36" w16cid:durableId="1729961498">
     <w:abstractNumId w:val="3"/>
+  </w:num>
+  <w:num w:numId="37" w16cid:durableId="668597">
+    <w:abstractNumId w:val="29"/>
+  </w:num>
+  <w:num w:numId="38" w16cid:durableId="1541891991">
+    <w:abstractNumId w:val="18"/>
   </w:num>
 </w:numbering>
 </file>
@@ -9224,6 +9109,22 @@
 </file>
 
 <file path=customXml/item1.xml><?xml version="1.0" encoding="utf-8"?>
+<b:Sources xmlns:b="http://schemas.openxmlformats.org/officeDocument/2006/bibliography" xmlns="http://schemas.openxmlformats.org/officeDocument/2006/bibliography" SelectedStyle="\APA.XSL" StyleName="APA"/>
+</file>
+
+<file path=customXml/item2.xml><?xml version="1.0" encoding="utf-8"?>
+<p:properties xmlns:p="http://schemas.microsoft.com/office/2006/metadata/properties" xmlns:xsi="http://www.w3.org/2001/XMLSchema-instance" xmlns:pc="http://schemas.microsoft.com/office/infopath/2007/PartnerControls">
+  <documentManagement>
+    <TaxCatchAll xmlns="a8e5abd5-4a68-4532-ab4e-f8b6047c71d9" xsi:nil="true"/>
+    <ReferenceId xmlns="ffb3042e-7aa6-4477-963b-117210bb9a5a" xsi:nil="true"/>
+    <lcf76f155ced4ddcb4097134ff3c332f xmlns="ffb3042e-7aa6-4477-963b-117210bb9a5a">
+      <Terms xmlns="http://schemas.microsoft.com/office/infopath/2007/PartnerControls"/>
+    </lcf76f155ced4ddcb4097134ff3c332f>
+  </documentManagement>
+</p:properties>
+</file>
+
+<file path=customXml/item3.xml><?xml version="1.0" encoding="utf-8"?>
 <?mso-contentType ?>
 <FormTemplates xmlns="http://schemas.microsoft.com/sharepoint/v3/contenttype/forms">
   <Display>DocumentLibraryForm</Display>
@@ -9232,7 +9133,7 @@
 </FormTemplates>
 </file>
 
-<file path=customXml/item2.xml><?xml version="1.0" encoding="utf-8"?>
+<file path=customXml/item4.xml><?xml version="1.0" encoding="utf-8"?>
 <ct:contentTypeSchema xmlns:ct="http://schemas.microsoft.com/office/2006/metadata/contentType" xmlns:ma="http://schemas.microsoft.com/office/2006/metadata/properties/metaAttributes" ct:_="" ma:_="" ma:contentTypeName="Document" ma:contentTypeID="0x010100DA604834E96D304AAFE64DE8819F0AE6" ma:contentTypeVersion="11" ma:contentTypeDescription="Create a new document." ma:contentTypeScope="" ma:versionID="ee9062911258d7acff46135caaf4a3b7">
   <xsd:schema xmlns:xsd="http://www.w3.org/2001/XMLSchema" xmlns:xs="http://www.w3.org/2001/XMLSchema" xmlns:p="http://schemas.microsoft.com/office/2006/metadata/properties" xmlns:ns2="ffb3042e-7aa6-4477-963b-117210bb9a5a" xmlns:ns3="a8e5abd5-4a68-4532-ab4e-f8b6047c71d9" targetNamespace="http://schemas.microsoft.com/office/2006/metadata/properties" ma:root="true" ma:fieldsID="a581d634fa98a3b36603a1feaba87db9" ns2:_="" ns3:_="">
     <xsd:import namespace="ffb3042e-7aa6-4477-963b-117210bb9a5a"/>
@@ -9427,23 +9328,26 @@
 </ct:contentTypeSchema>
 </file>
 
-<file path=customXml/item3.xml><?xml version="1.0" encoding="utf-8"?>
-<b:Sources xmlns:b="http://schemas.openxmlformats.org/officeDocument/2006/bibliography" xmlns="http://schemas.openxmlformats.org/officeDocument/2006/bibliography" SelectedStyle="\APA.XSL" StyleName="APA"/>
+<file path=customXml/itemProps1.xml><?xml version="1.0" encoding="utf-8"?>
+<ds:datastoreItem xmlns:ds="http://schemas.openxmlformats.org/officeDocument/2006/customXml" ds:itemID="{BE521747-BA93-43F2-A1E8-705C21D6DB3E}">
+  <ds:schemaRefs>
+    <ds:schemaRef ds:uri="http://schemas.openxmlformats.org/officeDocument/2006/bibliography"/>
+  </ds:schemaRefs>
+</ds:datastoreItem>
 </file>
 
-<file path=customXml/item4.xml><?xml version="1.0" encoding="utf-8"?>
-<p:properties xmlns:p="http://schemas.microsoft.com/office/2006/metadata/properties" xmlns:xsi="http://www.w3.org/2001/XMLSchema-instance" xmlns:pc="http://schemas.microsoft.com/office/infopath/2007/PartnerControls">
-  <documentManagement>
-    <TaxCatchAll xmlns="a8e5abd5-4a68-4532-ab4e-f8b6047c71d9" xsi:nil="true"/>
-    <ReferenceId xmlns="ffb3042e-7aa6-4477-963b-117210bb9a5a" xsi:nil="true"/>
-    <lcf76f155ced4ddcb4097134ff3c332f xmlns="ffb3042e-7aa6-4477-963b-117210bb9a5a">
-      <Terms xmlns="http://schemas.microsoft.com/office/infopath/2007/PartnerControls"/>
-    </lcf76f155ced4ddcb4097134ff3c332f>
-  </documentManagement>
-</p:properties>
+<file path=customXml/itemProps2.xml><?xml version="1.0" encoding="utf-8"?>
+<ds:datastoreItem xmlns:ds="http://schemas.openxmlformats.org/officeDocument/2006/customXml" ds:itemID="{1529C74D-0684-41AA-ABD0-D96035A8C7CC}">
+  <ds:schemaRefs>
+    <ds:schemaRef ds:uri="http://schemas.microsoft.com/office/2006/metadata/properties"/>
+    <ds:schemaRef ds:uri="http://schemas.microsoft.com/office/infopath/2007/PartnerControls"/>
+    <ds:schemaRef ds:uri="a8e5abd5-4a68-4532-ab4e-f8b6047c71d9"/>
+    <ds:schemaRef ds:uri="ffb3042e-7aa6-4477-963b-117210bb9a5a"/>
+  </ds:schemaRefs>
+</ds:datastoreItem>
 </file>
 
-<file path=customXml/itemProps1.xml><?xml version="1.0" encoding="utf-8"?>
+<file path=customXml/itemProps3.xml><?xml version="1.0" encoding="utf-8"?>
 <ds:datastoreItem xmlns:ds="http://schemas.openxmlformats.org/officeDocument/2006/customXml" ds:itemID="{FBAC6F0A-1C69-45E2-A44A-BCE0926327A8}">
   <ds:schemaRefs>
     <ds:schemaRef ds:uri="http://schemas.microsoft.com/sharepoint/v3/contenttype/forms"/>
@@ -9451,7 +9355,7 @@
 </ds:datastoreItem>
 </file>
 
-<file path=customXml/itemProps2.xml><?xml version="1.0" encoding="utf-8"?>
+<file path=customXml/itemProps4.xml><?xml version="1.0" encoding="utf-8"?>
 <ds:datastoreItem xmlns:ds="http://schemas.openxmlformats.org/officeDocument/2006/customXml" ds:itemID="{14F35175-5B2A-4DCA-8C55-8298E0B40431}">
   <ds:schemaRefs>
     <ds:schemaRef ds:uri="http://schemas.microsoft.com/office/2006/metadata/contentType"/>
@@ -9468,23 +9372,4 @@
     <ds:schemaRef ds:uri="http://schemas.microsoft.com/internal/obd"/>
   </ds:schemaRefs>
 </ds:datastoreItem>
-</file>
-
-<file path=customXml/itemProps3.xml><?xml version="1.0" encoding="utf-8"?>
-<ds:datastoreItem xmlns:ds="http://schemas.openxmlformats.org/officeDocument/2006/customXml" ds:itemID="{BE521747-BA93-43F2-A1E8-705C21D6DB3E}">
-  <ds:schemaRefs>
-    <ds:schemaRef ds:uri="http://schemas.openxmlformats.org/officeDocument/2006/bibliography"/>
-  </ds:schemaRefs>
-</ds:datastoreItem>
-</file>
-
-<file path=customXml/itemProps4.xml><?xml version="1.0" encoding="utf-8"?>
-<ds:datastoreItem xmlns:ds="http://schemas.openxmlformats.org/officeDocument/2006/customXml" ds:itemID="{1529C74D-0684-41AA-ABD0-D96035A8C7CC}">
-  <ds:schemaRefs>
-    <ds:schemaRef ds:uri="http://schemas.microsoft.com/office/2006/metadata/properties"/>
-    <ds:schemaRef ds:uri="http://schemas.microsoft.com/office/infopath/2007/PartnerControls"/>
-    <ds:schemaRef ds:uri="a8e5abd5-4a68-4532-ab4e-f8b6047c71d9"/>
-    <ds:schemaRef ds:uri="ffb3042e-7aa6-4477-963b-117210bb9a5a"/>
-  </ds:schemaRefs>
-</ds:datastoreItem>
 </file>
</xml_diff>